<commit_message>
Working on syllabus and schedule
</commit_message>
<xml_diff>
--- a/math121-syllabus-7-11-2026.docx
+++ b/math121-syllabus-7-11-2026.docx
@@ -23,35 +23,28 @@
           <w:sz w:val="28"/>
           <w:szCs w:val="28"/>
         </w:rPr>
-        <w:t>COMP</w:t>
+        <w:t xml:space="preserve">MATH </w:t>
       </w:r>
       <w:r>
         <w:rPr>
           <w:sz w:val="28"/>
           <w:szCs w:val="28"/>
         </w:rPr>
-        <w:t xml:space="preserve">/MATH </w:t>
+        <w:t>121:</w:t>
       </w:r>
       <w:r>
         <w:rPr>
           <w:sz w:val="28"/>
           <w:szCs w:val="28"/>
         </w:rPr>
-        <w:t>314</w:t>
+        <w:t xml:space="preserve"> </w:t>
       </w:r>
       <w:r>
         <w:rPr>
           <w:sz w:val="28"/>
           <w:szCs w:val="28"/>
         </w:rPr>
-        <w:t xml:space="preserve">, </w:t>
-      </w:r>
-      <w:r>
-        <w:rPr>
-          <w:sz w:val="28"/>
-          <w:szCs w:val="28"/>
-        </w:rPr>
-        <w:t>Computability and Complexity</w:t>
+        <w:t>Elementary Statistics</w:t>
       </w:r>
     </w:p>
     <w:p>
@@ -75,7 +68,14 @@
           <w:sz w:val="22"/>
           <w:szCs w:val="22"/>
         </w:rPr>
-        <w:t>Spring 20</w:t>
+        <w:t>Fall</w:t>
+      </w:r>
+      <w:r>
+        <w:rPr>
+          <w:sz w:val="22"/>
+          <w:szCs w:val="22"/>
+        </w:rPr>
+        <w:t xml:space="preserve"> 20</w:t>
       </w:r>
       <w:r>
         <w:rPr>
@@ -155,7 +155,7 @@
           <w:sz w:val="22"/>
           <w:szCs w:val="22"/>
         </w:rPr>
-        <w:t>understand what types of computations can be performed in theory and in practice</w:t>
+        <w:t>understand the basic concepts of descriptive statistics, including how to summarize data both graphically and numerically</w:t>
       </w:r>
     </w:p>
     <w:p>
@@ -175,7 +175,7 @@
           <w:sz w:val="22"/>
           <w:szCs w:val="22"/>
         </w:rPr>
-        <w:t>understand abstract computational models (such as Turing machines and finite automata), elementary notions of universality and undecidability, and their significance for practical computing</w:t>
+        <w:t>understand the concepts and techniques for computing basic point and interval estimates</w:t>
       </w:r>
     </w:p>
     <w:p>
@@ -195,7 +195,7 @@
           <w:sz w:val="22"/>
           <w:szCs w:val="22"/>
         </w:rPr>
-        <w:t>understand elementary notions of complexity theory, including complexity classes P, EXP, NP, and the concept of NP-completeness</w:t>
+        <w:t>understand the concepts and techniques for performing basic statistical inference</w:t>
       </w:r>
     </w:p>
     <w:p>
@@ -215,7 +215,7 @@
           <w:sz w:val="22"/>
           <w:szCs w:val="22"/>
         </w:rPr>
-        <w:t>[W</w:t>
+        <w:t>[</w:t>
       </w:r>
       <w:r>
         <w:rPr>
@@ -224,7 +224,7 @@
           <w:sz w:val="22"/>
           <w:szCs w:val="22"/>
         </w:rPr>
-        <w:t xml:space="preserve">riting in Discipline </w:t>
+        <w:t xml:space="preserve">Quantitative Reasoning </w:t>
       </w:r>
       <w:r>
         <w:rPr>
@@ -233,9 +233,8 @@
           <w:sz w:val="22"/>
           <w:szCs w:val="22"/>
         </w:rPr>
-        <w:t xml:space="preserve">goal] </w:t>
-      </w:r>
-      <w:proofErr w:type="gramStart"/>
+        <w:t>goal</w:t>
+      </w:r>
       <w:r>
         <w:rPr>
           <w:b w:val="0"/>
@@ -243,9 +242,8 @@
           <w:sz w:val="22"/>
           <w:szCs w:val="22"/>
         </w:rPr>
-        <w:t>increase</w:t>
-      </w:r>
-      <w:proofErr w:type="gramEnd"/>
+        <w:t>s</w:t>
+      </w:r>
       <w:r>
         <w:rPr>
           <w:b w:val="0"/>
@@ -253,7 +251,61 @@
           <w:sz w:val="22"/>
           <w:szCs w:val="22"/>
         </w:rPr>
-        <w:t xml:space="preserve"> mathematical maturity by making rigorous written mathematical arguments about computations</w:t>
+        <w:t xml:space="preserve">] </w:t>
+      </w:r>
+      <w:r>
+        <w:rPr>
+          <w:b w:val="0"/>
+          <w:bCs w:val="0"/>
+          <w:sz w:val="22"/>
+          <w:szCs w:val="22"/>
+        </w:rPr>
+        <w:t>(i) r</w:t>
+      </w:r>
+      <w:r>
+        <w:rPr>
+          <w:b w:val="0"/>
+          <w:bCs w:val="0"/>
+          <w:sz w:val="22"/>
+          <w:szCs w:val="22"/>
+        </w:rPr>
+        <w:t>ecognize quantitative assertions (i.e., involving numbers, logic and or graphics) and their underlying assumptions</w:t>
+      </w:r>
+      <w:r>
+        <w:rPr>
+          <w:b w:val="0"/>
+          <w:bCs w:val="0"/>
+          <w:sz w:val="22"/>
+          <w:szCs w:val="22"/>
+        </w:rPr>
+        <w:t>; (ii) c</w:t>
+      </w:r>
+      <w:r>
+        <w:rPr>
+          <w:b w:val="0"/>
+          <w:bCs w:val="0"/>
+          <w:sz w:val="22"/>
+          <w:szCs w:val="22"/>
+        </w:rPr>
+        <w:t>ritically evaluate quantitative information</w:t>
+      </w:r>
+      <w:r>
+        <w:rPr>
+          <w:b w:val="0"/>
+          <w:bCs w:val="0"/>
+          <w:sz w:val="22"/>
+          <w:szCs w:val="22"/>
+        </w:rPr>
+        <w:t>; (iii) u</w:t>
+      </w:r>
+      <w:r>
+        <w:rPr>
+          <w:b w:val="0"/>
+          <w:bCs w:val="0"/>
+          <w:sz w:val="22"/>
+          <w:szCs w:val="22"/>
+        </w:rPr>
+        <w:t>se quantitative methods to support an argument</w:t>
       </w:r>
     </w:p>
     <w:p>
@@ -480,7 +532,7 @@
           <w:sz w:val="22"/>
           <w:szCs w:val="22"/>
         </w:rPr>
-        <w:t>Tues</w:t>
+        <w:t>Mon</w:t>
       </w:r>
       <w:r>
         <w:rPr>
@@ -508,7 +560,7 @@
           <w:sz w:val="22"/>
           <w:szCs w:val="22"/>
         </w:rPr>
-        <w:t>Fri</w:t>
+        <w:t>Thurs</w:t>
       </w:r>
       <w:r>
         <w:rPr>
@@ -597,11 +649,10 @@
       </w:r>
       <w:r>
         <w:rPr>
-          <w:color w:val="3F0065"/>
-          <w:sz w:val="22"/>
-          <w:szCs w:val="22"/>
-        </w:rPr>
-        <w:t>117 [changed 1/27/2026]</w:t>
+          <w:sz w:val="22"/>
+          <w:szCs w:val="22"/>
+        </w:rPr>
+        <w:t>117</w:t>
       </w:r>
     </w:p>
     <w:p>
@@ -636,7 +687,7 @@
             <w:sz w:val="22"/>
             <w:szCs w:val="22"/>
           </w:rPr>
-          <w:t xml:space="preserve">office hour </w:t>
+          <w:t>office</w:t>
         </w:r>
         <w:r>
           <w:rPr>
@@ -644,7 +695,39 @@
             <w:sz w:val="22"/>
             <w:szCs w:val="22"/>
           </w:rPr>
-          <w:t>webpage</w:t>
+          <w:t xml:space="preserve"> </w:t>
+        </w:r>
+        <w:r>
+          <w:rPr>
+            <w:rStyle w:val="Hyperlink"/>
+            <w:sz w:val="22"/>
+            <w:szCs w:val="22"/>
+          </w:rPr>
+          <w:t xml:space="preserve">hour </w:t>
+        </w:r>
+        <w:r>
+          <w:rPr>
+            <w:rStyle w:val="Hyperlink"/>
+            <w:sz w:val="22"/>
+            <w:szCs w:val="22"/>
+          </w:rPr>
+          <w:t>w</w:t>
+        </w:r>
+        <w:r>
+          <w:rPr>
+            <w:rStyle w:val="Hyperlink"/>
+            <w:sz w:val="22"/>
+            <w:szCs w:val="22"/>
+          </w:rPr>
+          <w:t>e</w:t>
+        </w:r>
+        <w:r>
+          <w:rPr>
+            <w:rStyle w:val="Hyperlink"/>
+            <w:sz w:val="22"/>
+            <w:szCs w:val="22"/>
+          </w:rPr>
+          <w:t>bpage</w:t>
         </w:r>
       </w:hyperlink>
       <w:r>
@@ -678,35 +761,90 @@
           <w:sz w:val="22"/>
           <w:szCs w:val="22"/>
         </w:rPr>
-        <w:t>Free electronic access to t</w:t>
-      </w:r>
-      <w:r>
-        <w:rPr>
-          <w:sz w:val="22"/>
-          <w:szCs w:val="22"/>
-        </w:rPr>
-        <w:t>he following</w:t>
-      </w:r>
-      <w:r>
-        <w:rPr>
-          <w:sz w:val="22"/>
-          <w:szCs w:val="22"/>
-        </w:rPr>
-        <w:t xml:space="preserve"> required</w:t>
-      </w:r>
-      <w:r>
-        <w:rPr>
-          <w:sz w:val="22"/>
-          <w:szCs w:val="22"/>
-        </w:rPr>
-        <w:t xml:space="preserve"> textbook i</w:t>
-      </w:r>
-      <w:r>
-        <w:rPr>
-          <w:sz w:val="22"/>
-          <w:szCs w:val="22"/>
-        </w:rPr>
-        <w:t>s available through the Dickinson Library:</w:t>
+        <w:t>You are required to purchase a paper copy of the course pack:</w:t>
+      </w:r>
+    </w:p>
+    <w:p>
+      <w:pPr>
+        <w:pStyle w:val="ListParagraph"/>
+        <w:numPr>
+          <w:ilvl w:val="0"/>
+          <w:numId w:val="17"/>
+        </w:numPr>
+        <w:rPr>
+          <w:sz w:val="22"/>
+          <w:szCs w:val="22"/>
+        </w:rPr>
+      </w:pPr>
+      <w:r>
+        <w:rPr>
+          <w:sz w:val="22"/>
+          <w:szCs w:val="22"/>
+        </w:rPr>
+        <w:t>Math 121: Elementary Statistics Version 3.1</w:t>
+      </w:r>
+      <w:r>
+        <w:rPr>
+          <w:sz w:val="22"/>
+          <w:szCs w:val="22"/>
+        </w:rPr>
+        <w:t xml:space="preserve">. </w:t>
+      </w:r>
+    </w:p>
+    <w:p>
+      <w:pPr>
+        <w:pStyle w:val="ListParagraph"/>
+        <w:numPr>
+          <w:ilvl w:val="1"/>
+          <w:numId w:val="17"/>
+        </w:numPr>
+        <w:rPr>
+          <w:sz w:val="22"/>
+          <w:szCs w:val="22"/>
+        </w:rPr>
+      </w:pPr>
+      <w:r>
+        <w:rPr>
+          <w:sz w:val="22"/>
+          <w:szCs w:val="22"/>
+        </w:rPr>
+        <w:t>The course pack is not available electronically.</w:t>
+      </w:r>
+    </w:p>
+    <w:p>
+      <w:pPr>
+        <w:rPr>
+          <w:sz w:val="22"/>
+          <w:szCs w:val="22"/>
+        </w:rPr>
+      </w:pPr>
+      <w:r>
+        <w:rPr>
+          <w:sz w:val="22"/>
+          <w:szCs w:val="22"/>
+        </w:rPr>
+        <w:t xml:space="preserve">The </w:t>
+      </w:r>
+      <w:r>
+        <w:rPr>
+          <w:sz w:val="22"/>
+          <w:szCs w:val="22"/>
+        </w:rPr>
+        <w:t xml:space="preserve">course pack </w:t>
+      </w:r>
+      <w:r>
+        <w:rPr>
+          <w:sz w:val="22"/>
+          <w:szCs w:val="22"/>
+        </w:rPr>
+        <w:t>closely follows the content of the following book</w:t>
+      </w:r>
+      <w:r>
+        <w:rPr>
+          <w:sz w:val="22"/>
+          <w:szCs w:val="22"/>
+        </w:rPr>
+        <w:t>:</w:t>
       </w:r>
     </w:p>
     <w:p>
@@ -728,34 +866,42 @@
           <w:sz w:val="22"/>
           <w:szCs w:val="22"/>
         </w:rPr>
-        <w:t xml:space="preserve">What Can Be </w:t>
-      </w:r>
-      <w:proofErr w:type="gramStart"/>
-      <w:r>
-        <w:rPr>
-          <w:i/>
-          <w:iCs/>
-          <w:sz w:val="22"/>
-          <w:szCs w:val="22"/>
-        </w:rPr>
-        <w:t>Computed?:</w:t>
-      </w:r>
-      <w:proofErr w:type="gramEnd"/>
-      <w:r>
-        <w:rPr>
-          <w:i/>
-          <w:iCs/>
-          <w:sz w:val="22"/>
-          <w:szCs w:val="22"/>
-        </w:rPr>
-        <w:t xml:space="preserve"> A Practical Guide to the Theory of Computation</w:t>
-      </w:r>
-      <w:r>
-        <w:rPr>
-          <w:sz w:val="22"/>
-          <w:szCs w:val="22"/>
-        </w:rPr>
-        <w:t>, John MacCormick (2018)</w:t>
+        <w:t>Introductory Statistics: Exploring the World Through Data</w:t>
+      </w:r>
+      <w:r>
+        <w:rPr>
+          <w:sz w:val="22"/>
+          <w:szCs w:val="22"/>
+        </w:rPr>
+        <w:t>, by Gould, Wong, and Ryan, 3rd ed</w:t>
+      </w:r>
+      <w:r>
+        <w:rPr>
+          <w:sz w:val="22"/>
+          <w:szCs w:val="22"/>
+        </w:rPr>
+        <w:t>ition (2019)</w:t>
+      </w:r>
+      <w:r>
+        <w:rPr>
+          <w:sz w:val="22"/>
+          <w:szCs w:val="22"/>
+        </w:rPr>
+        <w:t>, Pearson</w:t>
+      </w:r>
+      <w:r>
+        <w:rPr>
+          <w:sz w:val="22"/>
+          <w:szCs w:val="22"/>
+        </w:rPr>
+        <w:t xml:space="preserve">. ISBN </w:t>
+      </w:r>
+      <w:r>
+        <w:rPr>
+          <w:sz w:val="22"/>
+          <w:szCs w:val="22"/>
+        </w:rPr>
+        <w:t>978-0135188927</w:t>
       </w:r>
       <w:r>
         <w:rPr>
@@ -767,11 +913,30 @@
     </w:p>
     <w:p>
       <w:pPr>
-        <w:rPr>
-          <w:sz w:val="22"/>
-          <w:szCs w:val="22"/>
-        </w:rPr>
-      </w:pPr>
+        <w:pStyle w:val="ListParagraph"/>
+        <w:numPr>
+          <w:ilvl w:val="1"/>
+          <w:numId w:val="16"/>
+        </w:numPr>
+        <w:rPr>
+          <w:sz w:val="22"/>
+          <w:szCs w:val="22"/>
+        </w:rPr>
+      </w:pPr>
+      <w:r>
+        <w:rPr>
+          <w:sz w:val="22"/>
+          <w:szCs w:val="22"/>
+        </w:rPr>
+        <w:t>This book is not required, but it may be useful to consult for additional background reading.</w:t>
+      </w:r>
+      <w:r>
+        <w:rPr>
+          <w:sz w:val="22"/>
+          <w:szCs w:val="22"/>
+        </w:rPr>
+        <w:t xml:space="preserve"> A copy is on reserve in the library</w:t>
+      </w:r>
     </w:p>
     <w:p>
       <w:pPr>
@@ -780,259 +945,12 @@
           <w:szCs w:val="22"/>
         </w:rPr>
       </w:pPr>
-      <w:r>
-        <w:rPr>
-          <w:sz w:val="22"/>
-          <w:szCs w:val="22"/>
-        </w:rPr>
-        <w:t>You can also purchase a printed version of the textbook, but that is not required.</w:t>
-      </w:r>
     </w:p>
     <w:p>
       <w:pPr>
-        <w:rPr>
-          <w:sz w:val="22"/>
-          <w:szCs w:val="22"/>
-        </w:rPr>
-      </w:pPr>
-    </w:p>
-    <w:p>
-      <w:pPr>
-        <w:rPr>
-          <w:sz w:val="22"/>
-          <w:szCs w:val="22"/>
-        </w:rPr>
-      </w:pPr>
-      <w:r>
-        <w:rPr>
-          <w:sz w:val="22"/>
-          <w:szCs w:val="22"/>
-        </w:rPr>
-        <w:t>In addition</w:t>
-      </w:r>
-      <w:r>
-        <w:rPr>
-          <w:sz w:val="22"/>
-          <w:szCs w:val="22"/>
-        </w:rPr>
-        <w:t xml:space="preserve">, the following books provide useful content for those who are interested in </w:t>
-      </w:r>
-      <w:r>
-        <w:rPr>
-          <w:sz w:val="22"/>
-          <w:szCs w:val="22"/>
-        </w:rPr>
-        <w:t>further</w:t>
-      </w:r>
-      <w:r>
-        <w:rPr>
-          <w:sz w:val="22"/>
-          <w:szCs w:val="22"/>
-        </w:rPr>
-        <w:t xml:space="preserve"> background:</w:t>
-      </w:r>
-    </w:p>
-    <w:p>
-      <w:pPr>
-        <w:pStyle w:val="ListParagraph"/>
-        <w:numPr>
-          <w:ilvl w:val="0"/>
-          <w:numId w:val="15"/>
-        </w:numPr>
-        <w:rPr>
-          <w:rFonts w:cs="Arial"/>
-          <w:i/>
-          <w:sz w:val="22"/>
-          <w:szCs w:val="22"/>
-        </w:rPr>
-      </w:pPr>
-      <w:r>
-        <w:rPr>
-          <w:rFonts w:cs="Arial"/>
-          <w:sz w:val="22"/>
-          <w:szCs w:val="22"/>
-        </w:rPr>
-        <w:t xml:space="preserve">Linz, </w:t>
-      </w:r>
-      <w:r>
-        <w:rPr>
-          <w:rFonts w:cs="Arial"/>
-          <w:i/>
-          <w:sz w:val="22"/>
-          <w:szCs w:val="22"/>
-        </w:rPr>
-        <w:t xml:space="preserve">An Introduction to </w:t>
-      </w:r>
-      <w:r>
-        <w:rPr>
-          <w:rFonts w:cs="Arial"/>
-          <w:i/>
-          <w:sz w:val="22"/>
-          <w:szCs w:val="22"/>
-        </w:rPr>
-        <w:t>Formal Languages and Automata</w:t>
-      </w:r>
-    </w:p>
-    <w:p>
-      <w:pPr>
-        <w:pStyle w:val="ListParagraph"/>
-        <w:numPr>
-          <w:ilvl w:val="0"/>
-          <w:numId w:val="15"/>
-        </w:numPr>
-        <w:rPr>
-          <w:rFonts w:cs="Arial"/>
-          <w:i/>
-          <w:sz w:val="22"/>
-          <w:szCs w:val="22"/>
-        </w:rPr>
-      </w:pPr>
-      <w:r>
-        <w:rPr>
-          <w:rFonts w:cs="Arial"/>
-          <w:sz w:val="22"/>
-          <w:szCs w:val="22"/>
-        </w:rPr>
-        <w:t xml:space="preserve">Moore and Mertens, </w:t>
-      </w:r>
-      <w:r>
-        <w:rPr>
-          <w:rFonts w:cs="Arial"/>
-          <w:i/>
-          <w:sz w:val="22"/>
-          <w:szCs w:val="22"/>
-        </w:rPr>
-        <w:t>The Nature of Computation</w:t>
-      </w:r>
-    </w:p>
-    <w:p>
-      <w:pPr>
-        <w:pStyle w:val="ListParagraph"/>
-        <w:numPr>
-          <w:ilvl w:val="0"/>
-          <w:numId w:val="15"/>
-        </w:numPr>
-        <w:rPr>
-          <w:rFonts w:cs="Arial"/>
-          <w:i/>
-          <w:sz w:val="22"/>
-          <w:szCs w:val="22"/>
-        </w:rPr>
-      </w:pPr>
-      <w:r>
-        <w:rPr>
-          <w:rFonts w:cs="Arial"/>
-          <w:sz w:val="22"/>
-          <w:szCs w:val="22"/>
-        </w:rPr>
-        <w:t xml:space="preserve">Sipser, </w:t>
-      </w:r>
-      <w:r>
-        <w:rPr>
-          <w:rFonts w:cs="Arial"/>
-          <w:i/>
-          <w:sz w:val="22"/>
-          <w:szCs w:val="22"/>
-        </w:rPr>
-        <w:t>Introduction to the Theory of Computation</w:t>
-      </w:r>
-    </w:p>
-    <w:p>
-      <w:pPr>
-        <w:pStyle w:val="ListParagraph"/>
-        <w:numPr>
-          <w:ilvl w:val="0"/>
-          <w:numId w:val="15"/>
-        </w:numPr>
-        <w:rPr>
-          <w:rFonts w:cs="Arial"/>
-          <w:i/>
-          <w:sz w:val="22"/>
-          <w:szCs w:val="22"/>
-        </w:rPr>
-      </w:pPr>
-      <w:r>
-        <w:rPr>
-          <w:rFonts w:cs="Arial"/>
-          <w:sz w:val="22"/>
-          <w:szCs w:val="22"/>
-        </w:rPr>
-        <w:t xml:space="preserve">Lewis and Papadimitriou, </w:t>
-      </w:r>
-      <w:r>
-        <w:rPr>
-          <w:rFonts w:cs="Arial"/>
-          <w:i/>
-          <w:sz w:val="22"/>
-          <w:szCs w:val="22"/>
-        </w:rPr>
-        <w:t>Elements of the Theory of Computation</w:t>
-      </w:r>
-    </w:p>
-    <w:p>
-      <w:pPr>
-        <w:pStyle w:val="ListParagraph"/>
-        <w:numPr>
-          <w:ilvl w:val="0"/>
-          <w:numId w:val="15"/>
-        </w:numPr>
-        <w:rPr>
-          <w:rFonts w:cs="Arial"/>
-          <w:i/>
-          <w:sz w:val="22"/>
-          <w:szCs w:val="22"/>
-        </w:rPr>
-      </w:pPr>
-      <w:r>
-        <w:rPr>
-          <w:rFonts w:cs="Arial"/>
-          <w:sz w:val="22"/>
-          <w:szCs w:val="22"/>
-        </w:rPr>
-        <w:t xml:space="preserve">Fortnow, </w:t>
-      </w:r>
-      <w:r>
-        <w:rPr>
-          <w:rFonts w:cs="Arial"/>
-          <w:i/>
-          <w:sz w:val="22"/>
-          <w:szCs w:val="22"/>
-        </w:rPr>
-        <w:t>The Golden Ticket</w:t>
-      </w:r>
-      <w:r>
-        <w:rPr>
-          <w:rFonts w:cs="Arial"/>
-          <w:i/>
-          <w:sz w:val="22"/>
-          <w:szCs w:val="22"/>
-        </w:rPr>
-        <w:t>: P, NP, and the Search for the Impossible</w:t>
-      </w:r>
-    </w:p>
-    <w:p>
-      <w:pPr>
-        <w:rPr>
-          <w:rFonts w:cs="Arial"/>
-          <w:sz w:val="22"/>
-          <w:szCs w:val="22"/>
-        </w:rPr>
-      </w:pPr>
-      <w:r>
-        <w:rPr>
-          <w:rFonts w:cs="Arial"/>
-          <w:sz w:val="22"/>
-          <w:szCs w:val="22"/>
-        </w:rPr>
-        <w:t>Please consult with the instructor for guidance on which parts of the above books would best suit your background reading goals.</w:t>
-      </w:r>
-    </w:p>
-    <w:p>
-      <w:pPr>
         <w:pStyle w:val="Heading3"/>
       </w:pPr>
       <w:r>
-        <w:lastRenderedPageBreak/>
         <w:t xml:space="preserve">Assessment and </w:t>
       </w:r>
       <w:r>
@@ -1066,7 +984,7 @@
         <w:tblLook w:val="04A0" w:firstRow="1" w:lastRow="0" w:firstColumn="1" w:lastColumn="0" w:noHBand="0" w:noVBand="1"/>
       </w:tblPr>
       <w:tblGrid>
-        <w:gridCol w:w="5350"/>
+        <w:gridCol w:w="5625"/>
         <w:gridCol w:w="670"/>
       </w:tblGrid>
       <w:tr>
@@ -1075,7 +993,7 @@
         </w:trPr>
         <w:tc>
           <w:tcPr>
-            <w:tcW w:w="5350" w:type="dxa"/>
+            <w:tcW w:w="5625" w:type="dxa"/>
           </w:tcPr>
           <w:p>
             <w:pPr>
@@ -1110,7 +1028,14 @@
                 <w:sz w:val="22"/>
                 <w:szCs w:val="22"/>
               </w:rPr>
-              <w:t>4</w:t>
+              <w:t>approx.</w:t>
+            </w:r>
+            <w:r>
+              <w:rPr>
+                <w:sz w:val="22"/>
+                <w:szCs w:val="22"/>
+              </w:rPr>
+              <w:t>1</w:t>
             </w:r>
             <w:r>
               <w:rPr>
@@ -1137,7 +1062,7 @@
                 <w:sz w:val="22"/>
                 <w:szCs w:val="22"/>
               </w:rPr>
-              <w:t>4</w:t>
+              <w:t>1</w:t>
             </w:r>
             <w:r>
               <w:rPr>
@@ -1162,7 +1087,7 @@
         </w:trPr>
         <w:tc>
           <w:tcPr>
-            <w:tcW w:w="5350" w:type="dxa"/>
+            <w:tcW w:w="5625" w:type="dxa"/>
           </w:tcPr>
           <w:p>
             <w:pPr>
@@ -1176,14 +1101,94 @@
                 <w:sz w:val="22"/>
                 <w:szCs w:val="22"/>
               </w:rPr>
-              <w:t xml:space="preserve">Midterm exams (2 x </w:t>
+              <w:t xml:space="preserve">In-class quizzes (about 5 x </w:t>
             </w:r>
             <w:r>
               <w:rPr>
                 <w:sz w:val="22"/>
                 <w:szCs w:val="22"/>
               </w:rPr>
-              <w:t>15</w:t>
+              <w:t>approx.</w:t>
+            </w:r>
+            <w:r>
+              <w:rPr>
+                <w:sz w:val="22"/>
+                <w:szCs w:val="22"/>
+              </w:rPr>
+              <w:t>1% each)</w:t>
+            </w:r>
+          </w:p>
+        </w:tc>
+        <w:tc>
+          <w:tcPr>
+            <w:tcW w:w="670" w:type="dxa"/>
+          </w:tcPr>
+          <w:p>
+            <w:pPr>
+              <w:rPr>
+                <w:sz w:val="22"/>
+                <w:szCs w:val="22"/>
+              </w:rPr>
+            </w:pPr>
+            <w:r>
+              <w:rPr>
+                <w:sz w:val="22"/>
+                <w:szCs w:val="22"/>
+              </w:rPr>
+              <w:t>5%</w:t>
+            </w:r>
+          </w:p>
+        </w:tc>
+      </w:tr>
+      <w:tr>
+        <w:trPr>
+          <w:jc w:val="center"/>
+        </w:trPr>
+        <w:tc>
+          <w:tcPr>
+            <w:tcW w:w="5625" w:type="dxa"/>
+          </w:tcPr>
+          <w:p>
+            <w:pPr>
+              <w:rPr>
+                <w:sz w:val="22"/>
+                <w:szCs w:val="22"/>
+              </w:rPr>
+            </w:pPr>
+            <w:r>
+              <w:rPr>
+                <w:sz w:val="22"/>
+                <w:szCs w:val="22"/>
+              </w:rPr>
+              <w:t>Midterm exams (</w:t>
+            </w:r>
+            <w:r>
+              <w:rPr>
+                <w:sz w:val="22"/>
+                <w:szCs w:val="22"/>
+              </w:rPr>
+              <w:t>3</w:t>
+            </w:r>
+            <w:r>
+              <w:rPr>
+                <w:sz w:val="22"/>
+                <w:szCs w:val="22"/>
+              </w:rPr>
+              <w:t xml:space="preserve"> x </w:t>
+            </w:r>
+            <w:r>
+              <w:rPr>
+                <w:sz w:val="22"/>
+                <w:szCs w:val="22"/>
+              </w:rPr>
+              <w:t>approx.</w:t>
+            </w:r>
+            <w:r>
+              <w:rPr>
+                <w:sz w:val="22"/>
+                <w:szCs w:val="22"/>
+              </w:rPr>
+              <w:t>18</w:t>
             </w:r>
             <w:r>
               <w:rPr>
@@ -1210,14 +1215,14 @@
                 <w:sz w:val="22"/>
                 <w:szCs w:val="22"/>
               </w:rPr>
-              <w:t>3</w:t>
+              <w:t>55</w:t>
             </w:r>
             <w:r>
               <w:rPr>
                 <w:sz w:val="22"/>
                 <w:szCs w:val="22"/>
               </w:rPr>
-              <w:t>0%</w:t>
+              <w:t>%</w:t>
             </w:r>
           </w:p>
         </w:tc>
@@ -1228,7 +1233,7 @@
         </w:trPr>
         <w:tc>
           <w:tcPr>
-            <w:tcW w:w="5350" w:type="dxa"/>
+            <w:tcW w:w="5625" w:type="dxa"/>
           </w:tcPr>
           <w:p>
             <w:pPr>
@@ -1324,7 +1329,15 @@
           <w:sz w:val="22"/>
           <w:szCs w:val="22"/>
         </w:rPr>
-        <w:t xml:space="preserve">the dates specified on the class schedule. </w:t>
+        <w:t xml:space="preserve">the dates specified on the class </w:t>
+      </w:r>
+      <w:r>
+        <w:rPr>
+          <w:sz w:val="22"/>
+          <w:szCs w:val="22"/>
+        </w:rPr>
+        <w:lastRenderedPageBreak/>
+        <w:t xml:space="preserve">schedule. </w:t>
       </w:r>
       <w:r>
         <w:rPr>
@@ -1445,58 +1458,19 @@
         </w:rPr>
         <w:t xml:space="preserve">In all cases, it is the responsibility of the student to consult the </w:t>
       </w:r>
-      <w:proofErr w:type="gramStart"/>
-      <w:r>
-        <w:rPr>
-          <w:sz w:val="22"/>
-          <w:szCs w:val="22"/>
-        </w:rPr>
-        <w:t>provided solutions</w:t>
-      </w:r>
-      <w:proofErr w:type="gramEnd"/>
-      <w:r>
-        <w:rPr>
-          <w:sz w:val="22"/>
-          <w:szCs w:val="22"/>
-        </w:rPr>
-        <w:t xml:space="preserve"> and understand the correct approach to every question, </w:t>
-      </w:r>
-      <w:proofErr w:type="gramStart"/>
-      <w:r>
-        <w:rPr>
-          <w:sz w:val="22"/>
-          <w:szCs w:val="22"/>
-        </w:rPr>
-        <w:t>whether or not</w:t>
-      </w:r>
-      <w:proofErr w:type="gramEnd"/>
-      <w:r>
-        <w:rPr>
-          <w:sz w:val="22"/>
-          <w:szCs w:val="22"/>
-        </w:rPr>
-        <w:t xml:space="preserve"> it was graded.</w:t>
-      </w:r>
-      <w:r>
-        <w:rPr>
-          <w:sz w:val="22"/>
-          <w:szCs w:val="22"/>
-        </w:rPr>
-        <w:t xml:space="preserve"> </w:t>
-      </w:r>
-      <w:r>
-        <w:rPr>
-          <w:sz w:val="22"/>
-          <w:szCs w:val="22"/>
-        </w:rPr>
-        <w:t>As explained on the course webpages, you can recover 50% of the points lost on any assignment by resubmitting</w:t>
-      </w:r>
-      <w:r>
-        <w:rPr>
-          <w:sz w:val="22"/>
-          <w:szCs w:val="22"/>
-        </w:rPr>
-        <w:t xml:space="preserve"> a corrected version.</w:t>
+      <w:r>
+        <w:rPr>
+          <w:sz w:val="22"/>
+          <w:szCs w:val="22"/>
+        </w:rPr>
+        <w:t>solutions provided</w:t>
+      </w:r>
+      <w:r>
+        <w:rPr>
+          <w:sz w:val="22"/>
+          <w:szCs w:val="22"/>
+        </w:rPr>
+        <w:t xml:space="preserve"> and understand the correct approach to every question, whether or not it was graded.</w:t>
       </w:r>
     </w:p>
     <w:p>
@@ -1543,7 +1517,14 @@
           <w:sz w:val="22"/>
           <w:szCs w:val="22"/>
         </w:rPr>
-        <w:t xml:space="preserve"> There will be two</w:t>
+        <w:t xml:space="preserve"> There will be t</w:t>
+      </w:r>
+      <w:r>
+        <w:rPr>
+          <w:sz w:val="22"/>
+          <w:szCs w:val="22"/>
+        </w:rPr>
+        <w:t>hree</w:t>
       </w:r>
       <w:r>
         <w:rPr>
@@ -2005,23 +1986,7 @@
           <w:sz w:val="22"/>
           <w:szCs w:val="22"/>
         </w:rPr>
-        <w:t xml:space="preserve">is eligible to appear in the midterm or final exams. In practice, a strong majority of exam questions will be </w:t>
-      </w:r>
-      <w:proofErr w:type="gramStart"/>
-      <w:r>
-        <w:rPr>
-          <w:sz w:val="22"/>
-          <w:szCs w:val="22"/>
-        </w:rPr>
-        <w:t>similar to</w:t>
-      </w:r>
-      <w:proofErr w:type="gramEnd"/>
-      <w:r>
-        <w:rPr>
-          <w:sz w:val="22"/>
-          <w:szCs w:val="22"/>
-        </w:rPr>
-        <w:t xml:space="preserve"> a homework question</w:t>
+        <w:t>is eligible to appear in the midterm or final exams. In practice, a strong majority of exam questions will be similar to a homework question</w:t>
       </w:r>
       <w:r>
         <w:rPr>
@@ -2287,7 +2252,6 @@
           <w:sz w:val="22"/>
           <w:szCs w:val="22"/>
         </w:rPr>
-        <w:lastRenderedPageBreak/>
         <w:t xml:space="preserve">You may not copy </w:t>
       </w:r>
       <w:r>
@@ -2484,6 +2448,7 @@
           <w:sz w:val="22"/>
           <w:szCs w:val="22"/>
         </w:rPr>
+        <w:lastRenderedPageBreak/>
         <w:t>If you use ideas from any source without using the exact words or code</w:t>
       </w:r>
       <w:r>
@@ -2607,27 +2572,7 @@
           <w:sz w:val="22"/>
           <w:szCs w:val="22"/>
         </w:rPr>
-        <w:t xml:space="preserve">, you must destroy any written or electronic material that results from the discussion and re-create it </w:t>
-      </w:r>
-      <w:proofErr w:type="gramStart"/>
-      <w:r>
-        <w:rPr>
-          <w:b/>
-          <w:bCs/>
-          <w:sz w:val="22"/>
-          <w:szCs w:val="22"/>
-        </w:rPr>
-        <w:t>later on</w:t>
-      </w:r>
-      <w:proofErr w:type="gramEnd"/>
-      <w:r>
-        <w:rPr>
-          <w:b/>
-          <w:bCs/>
-          <w:sz w:val="22"/>
-          <w:szCs w:val="22"/>
-        </w:rPr>
-        <w:t xml:space="preserve"> your own.</w:t>
+        <w:t>, you must destroy any written or electronic material that results from the discussion and re-create it later on your own.</w:t>
       </w:r>
       <w:r>
         <w:rPr>
@@ -2737,11 +2682,9 @@
       <w:pPr>
         <w:pStyle w:val="Heading3"/>
       </w:pPr>
-      <w:proofErr w:type="gramStart"/>
       <w:r>
         <w:t>Accommodations</w:t>
       </w:r>
-      <w:proofErr w:type="gramEnd"/>
     </w:p>
     <w:p>
       <w:pPr>
@@ -3939,7 +3882,7 @@
         <w:rFonts w:ascii="Symbol" w:hAnsi="Symbol" w:hint="default"/>
       </w:rPr>
     </w:lvl>
-    <w:lvl w:ilvl="1" w:tplc="04090003" w:tentative="1">
+    <w:lvl w:ilvl="1" w:tplc="04090003">
       <w:start w:val="1"/>
       <w:numFmt w:val="bullet"/>
       <w:lvlText w:val="o"/>
@@ -5017,6 +4960,119 @@
     </w:lvl>
   </w:abstractNum>
   <w:abstractNum w:abstractNumId="15" w15:restartNumberingAfterBreak="0">
+    <w:nsid w:val="6D522DEC"/>
+    <w:multiLevelType w:val="hybridMultilevel"/>
+    <w:tmpl w:val="0284D114"/>
+    <w:lvl w:ilvl="0" w:tplc="04090001">
+      <w:start w:val="1"/>
+      <w:numFmt w:val="bullet"/>
+      <w:lvlText w:val=""/>
+      <w:lvlJc w:val="left"/>
+      <w:pPr>
+        <w:ind w:left="720" w:hanging="360"/>
+      </w:pPr>
+      <w:rPr>
+        <w:rFonts w:ascii="Symbol" w:hAnsi="Symbol" w:hint="default"/>
+      </w:rPr>
+    </w:lvl>
+    <w:lvl w:ilvl="1" w:tplc="04090003">
+      <w:start w:val="1"/>
+      <w:numFmt w:val="bullet"/>
+      <w:lvlText w:val="o"/>
+      <w:lvlJc w:val="left"/>
+      <w:pPr>
+        <w:ind w:left="1440" w:hanging="360"/>
+      </w:pPr>
+      <w:rPr>
+        <w:rFonts w:ascii="Courier New" w:hAnsi="Courier New" w:cs="Courier New" w:hint="default"/>
+      </w:rPr>
+    </w:lvl>
+    <w:lvl w:ilvl="2" w:tplc="04090005" w:tentative="1">
+      <w:start w:val="1"/>
+      <w:numFmt w:val="bullet"/>
+      <w:lvlText w:val=""/>
+      <w:lvlJc w:val="left"/>
+      <w:pPr>
+        <w:ind w:left="2160" w:hanging="360"/>
+      </w:pPr>
+      <w:rPr>
+        <w:rFonts w:ascii="Wingdings" w:hAnsi="Wingdings" w:hint="default"/>
+      </w:rPr>
+    </w:lvl>
+    <w:lvl w:ilvl="3" w:tplc="04090001" w:tentative="1">
+      <w:start w:val="1"/>
+      <w:numFmt w:val="bullet"/>
+      <w:lvlText w:val=""/>
+      <w:lvlJc w:val="left"/>
+      <w:pPr>
+        <w:ind w:left="2880" w:hanging="360"/>
+      </w:pPr>
+      <w:rPr>
+        <w:rFonts w:ascii="Symbol" w:hAnsi="Symbol" w:hint="default"/>
+      </w:rPr>
+    </w:lvl>
+    <w:lvl w:ilvl="4" w:tplc="04090003" w:tentative="1">
+      <w:start w:val="1"/>
+      <w:numFmt w:val="bullet"/>
+      <w:lvlText w:val="o"/>
+      <w:lvlJc w:val="left"/>
+      <w:pPr>
+        <w:ind w:left="3600" w:hanging="360"/>
+      </w:pPr>
+      <w:rPr>
+        <w:rFonts w:ascii="Courier New" w:hAnsi="Courier New" w:cs="Courier New" w:hint="default"/>
+      </w:rPr>
+    </w:lvl>
+    <w:lvl w:ilvl="5" w:tplc="04090005" w:tentative="1">
+      <w:start w:val="1"/>
+      <w:numFmt w:val="bullet"/>
+      <w:lvlText w:val=""/>
+      <w:lvlJc w:val="left"/>
+      <w:pPr>
+        <w:ind w:left="4320" w:hanging="360"/>
+      </w:pPr>
+      <w:rPr>
+        <w:rFonts w:ascii="Wingdings" w:hAnsi="Wingdings" w:hint="default"/>
+      </w:rPr>
+    </w:lvl>
+    <w:lvl w:ilvl="6" w:tplc="04090001" w:tentative="1">
+      <w:start w:val="1"/>
+      <w:numFmt w:val="bullet"/>
+      <w:lvlText w:val=""/>
+      <w:lvlJc w:val="left"/>
+      <w:pPr>
+        <w:ind w:left="5040" w:hanging="360"/>
+      </w:pPr>
+      <w:rPr>
+        <w:rFonts w:ascii="Symbol" w:hAnsi="Symbol" w:hint="default"/>
+      </w:rPr>
+    </w:lvl>
+    <w:lvl w:ilvl="7" w:tplc="04090003" w:tentative="1">
+      <w:start w:val="1"/>
+      <w:numFmt w:val="bullet"/>
+      <w:lvlText w:val="o"/>
+      <w:lvlJc w:val="left"/>
+      <w:pPr>
+        <w:ind w:left="5760" w:hanging="360"/>
+      </w:pPr>
+      <w:rPr>
+        <w:rFonts w:ascii="Courier New" w:hAnsi="Courier New" w:cs="Courier New" w:hint="default"/>
+      </w:rPr>
+    </w:lvl>
+    <w:lvl w:ilvl="8" w:tplc="04090005" w:tentative="1">
+      <w:start w:val="1"/>
+      <w:numFmt w:val="bullet"/>
+      <w:lvlText w:val=""/>
+      <w:lvlJc w:val="left"/>
+      <w:pPr>
+        <w:ind w:left="6480" w:hanging="360"/>
+      </w:pPr>
+      <w:rPr>
+        <w:rFonts w:ascii="Wingdings" w:hAnsi="Wingdings" w:hint="default"/>
+      </w:rPr>
+    </w:lvl>
+  </w:abstractNum>
+  <w:abstractNum w:abstractNumId="16" w15:restartNumberingAfterBreak="0">
     <w:nsid w:val="79A20689"/>
     <w:multiLevelType w:val="hybridMultilevel"/>
     <w:tmpl w:val="B8DC4D20"/>
@@ -5158,7 +5214,7 @@
     </w:lvl>
   </w:abstractNum>
   <w:num w:numId="1" w16cid:durableId="1675107197">
-    <w:abstractNumId w:val="15"/>
+    <w:abstractNumId w:val="16"/>
   </w:num>
   <w:num w:numId="2" w16cid:durableId="1138300417">
     <w:abstractNumId w:val="13"/>
@@ -5204,6 +5260,9 @@
   </w:num>
   <w:num w:numId="16" w16cid:durableId="2034258935">
     <w:abstractNumId w:val="7"/>
+  </w:num>
+  <w:num w:numId="17" w16cid:durableId="279992938">
+    <w:abstractNumId w:val="15"/>
   </w:num>
 </w:numbering>
 </file>
@@ -5643,7 +5702,6 @@
   <w:style w:type="character" w:default="1" w:styleId="DefaultParagraphFont">
     <w:name w:val="Default Paragraph Font"/>
     <w:uiPriority w:val="1"/>
-    <w:semiHidden/>
     <w:unhideWhenUsed/>
   </w:style>
   <w:style w:type="table" w:default="1" w:styleId="TableNormal">

</xml_diff>

<commit_message>
Finished initial draft of schedule and syllabus
</commit_message>
<xml_diff>
--- a/math121-syllabus-7-11-2026.docx
+++ b/math121-syllabus-7-11-2026.docx
@@ -175,7 +175,27 @@
           <w:sz w:val="22"/>
           <w:szCs w:val="22"/>
         </w:rPr>
-        <w:t>understand the concepts and techniques for computing basic point and interval estimates</w:t>
+        <w:t xml:space="preserve">understand the concepts and techniques for computing basic </w:t>
+      </w:r>
+      <w:proofErr w:type="gramStart"/>
+      <w:r>
+        <w:rPr>
+          <w:b w:val="0"/>
+          <w:bCs w:val="0"/>
+          <w:sz w:val="22"/>
+          <w:szCs w:val="22"/>
+        </w:rPr>
+        <w:t>point</w:t>
+      </w:r>
+      <w:proofErr w:type="gramEnd"/>
+      <w:r>
+        <w:rPr>
+          <w:b w:val="0"/>
+          <w:bCs w:val="0"/>
+          <w:sz w:val="22"/>
+          <w:szCs w:val="22"/>
+        </w:rPr>
+        <w:t xml:space="preserve"> and interval estimates</w:t>
       </w:r>
     </w:p>
     <w:p>
@@ -260,7 +280,27 @@
           <w:sz w:val="22"/>
           <w:szCs w:val="22"/>
         </w:rPr>
-        <w:t>(i) r</w:t>
+        <w:t>(</w:t>
+      </w:r>
+      <w:proofErr w:type="spellStart"/>
+      <w:r>
+        <w:rPr>
+          <w:b w:val="0"/>
+          <w:bCs w:val="0"/>
+          <w:sz w:val="22"/>
+          <w:szCs w:val="22"/>
+        </w:rPr>
+        <w:t>i</w:t>
+      </w:r>
+      <w:proofErr w:type="spellEnd"/>
+      <w:r>
+        <w:rPr>
+          <w:b w:val="0"/>
+          <w:bCs w:val="0"/>
+          <w:sz w:val="22"/>
+          <w:szCs w:val="22"/>
+        </w:rPr>
+        <w:t>) r</w:t>
       </w:r>
       <w:r>
         <w:rPr>
@@ -687,7 +727,7 @@
             <w:sz w:val="22"/>
             <w:szCs w:val="22"/>
           </w:rPr>
-          <w:t>office</w:t>
+          <w:t xml:space="preserve">office hour </w:t>
         </w:r>
         <w:r>
           <w:rPr>
@@ -695,39 +735,7 @@
             <w:sz w:val="22"/>
             <w:szCs w:val="22"/>
           </w:rPr>
-          <w:t xml:space="preserve"> </w:t>
-        </w:r>
-        <w:r>
-          <w:rPr>
-            <w:rStyle w:val="Hyperlink"/>
-            <w:sz w:val="22"/>
-            <w:szCs w:val="22"/>
-          </w:rPr>
-          <w:t xml:space="preserve">hour </w:t>
-        </w:r>
-        <w:r>
-          <w:rPr>
-            <w:rStyle w:val="Hyperlink"/>
-            <w:sz w:val="22"/>
-            <w:szCs w:val="22"/>
-          </w:rPr>
-          <w:t>w</w:t>
-        </w:r>
-        <w:r>
-          <w:rPr>
-            <w:rStyle w:val="Hyperlink"/>
-            <w:sz w:val="22"/>
-            <w:szCs w:val="22"/>
-          </w:rPr>
-          <w:t>e</w:t>
-        </w:r>
-        <w:r>
-          <w:rPr>
-            <w:rStyle w:val="Hyperlink"/>
-            <w:sz w:val="22"/>
-            <w:szCs w:val="22"/>
-          </w:rPr>
-          <w:t>bpage</w:t>
+          <w:t>webpage</w:t>
         </w:r>
       </w:hyperlink>
       <w:r>
@@ -761,7 +769,23 @@
           <w:sz w:val="22"/>
           <w:szCs w:val="22"/>
         </w:rPr>
-        <w:t>You are required to purchase a paper copy of the course pack:</w:t>
+        <w:t xml:space="preserve">You are required to purchase </w:t>
+      </w:r>
+      <w:proofErr w:type="gramStart"/>
+      <w:r>
+        <w:rPr>
+          <w:sz w:val="22"/>
+          <w:szCs w:val="22"/>
+        </w:rPr>
+        <w:t>a paper</w:t>
+      </w:r>
+      <w:proofErr w:type="gramEnd"/>
+      <w:r>
+        <w:rPr>
+          <w:sz w:val="22"/>
+          <w:szCs w:val="22"/>
+        </w:rPr>
+        <w:t xml:space="preserve"> copy of the course pack:</w:t>
       </w:r>
     </w:p>
     <w:p>
@@ -1101,65 +1125,6 @@
                 <w:sz w:val="22"/>
                 <w:szCs w:val="22"/>
               </w:rPr>
-              <w:t xml:space="preserve">In-class quizzes (about 5 x </w:t>
-            </w:r>
-            <w:r>
-              <w:rPr>
-                <w:sz w:val="22"/>
-                <w:szCs w:val="22"/>
-              </w:rPr>
-              <w:t>approx.</w:t>
-            </w:r>
-            <w:r>
-              <w:rPr>
-                <w:sz w:val="22"/>
-                <w:szCs w:val="22"/>
-              </w:rPr>
-              <w:t>1% each)</w:t>
-            </w:r>
-          </w:p>
-        </w:tc>
-        <w:tc>
-          <w:tcPr>
-            <w:tcW w:w="670" w:type="dxa"/>
-          </w:tcPr>
-          <w:p>
-            <w:pPr>
-              <w:rPr>
-                <w:sz w:val="22"/>
-                <w:szCs w:val="22"/>
-              </w:rPr>
-            </w:pPr>
-            <w:r>
-              <w:rPr>
-                <w:sz w:val="22"/>
-                <w:szCs w:val="22"/>
-              </w:rPr>
-              <w:t>5%</w:t>
-            </w:r>
-          </w:p>
-        </w:tc>
-      </w:tr>
-      <w:tr>
-        <w:trPr>
-          <w:jc w:val="center"/>
-        </w:trPr>
-        <w:tc>
-          <w:tcPr>
-            <w:tcW w:w="5625" w:type="dxa"/>
-          </w:tcPr>
-          <w:p>
-            <w:pPr>
-              <w:rPr>
-                <w:sz w:val="22"/>
-                <w:szCs w:val="22"/>
-              </w:rPr>
-            </w:pPr>
-            <w:r>
-              <w:rPr>
-                <w:sz w:val="22"/>
-                <w:szCs w:val="22"/>
-              </w:rPr>
               <w:t>Midterm exams (</w:t>
             </w:r>
             <w:r>
@@ -1181,14 +1146,7 @@
                 <w:sz w:val="22"/>
                 <w:szCs w:val="22"/>
               </w:rPr>
-              <w:t>approx.</w:t>
-            </w:r>
-            <w:r>
-              <w:rPr>
-                <w:sz w:val="22"/>
-                <w:szCs w:val="22"/>
-              </w:rPr>
-              <w:t>18</w:t>
+              <w:t>20</w:t>
             </w:r>
             <w:r>
               <w:rPr>
@@ -1215,7 +1173,7 @@
                 <w:sz w:val="22"/>
                 <w:szCs w:val="22"/>
               </w:rPr>
-              <w:t>55</w:t>
+              <w:t>60</w:t>
             </w:r>
             <w:r>
               <w:rPr>
@@ -1329,15 +1287,7 @@
           <w:sz w:val="22"/>
           <w:szCs w:val="22"/>
         </w:rPr>
-        <w:t xml:space="preserve">the dates specified on the class </w:t>
-      </w:r>
-      <w:r>
-        <w:rPr>
-          <w:sz w:val="22"/>
-          <w:szCs w:val="22"/>
-        </w:rPr>
-        <w:lastRenderedPageBreak/>
-        <w:t xml:space="preserve">schedule. </w:t>
+        <w:t xml:space="preserve">the dates specified on the class schedule. </w:t>
       </w:r>
       <w:r>
         <w:rPr>
@@ -1470,7 +1420,23 @@
           <w:sz w:val="22"/>
           <w:szCs w:val="22"/>
         </w:rPr>
-        <w:t xml:space="preserve"> and understand the correct approach to every question, whether or not it was graded.</w:t>
+        <w:t xml:space="preserve"> and understand the correct approach to every question, </w:t>
+      </w:r>
+      <w:proofErr w:type="gramStart"/>
+      <w:r>
+        <w:rPr>
+          <w:sz w:val="22"/>
+          <w:szCs w:val="22"/>
+        </w:rPr>
+        <w:t>whether or not</w:t>
+      </w:r>
+      <w:proofErr w:type="gramEnd"/>
+      <w:r>
+        <w:rPr>
+          <w:sz w:val="22"/>
+          <w:szCs w:val="22"/>
+        </w:rPr>
+        <w:t xml:space="preserve"> it was graded.</w:t>
       </w:r>
     </w:p>
     <w:p>
@@ -1586,7 +1552,7 @@
           <w:sz w:val="22"/>
           <w:szCs w:val="22"/>
         </w:rPr>
-        <w:t>ues</w:t>
+        <w:t>hur</w:t>
       </w:r>
       <w:r>
         <w:rPr>
@@ -1596,7 +1562,7 @@
           <w:sz w:val="22"/>
           <w:szCs w:val="22"/>
         </w:rPr>
-        <w:t xml:space="preserve">day, March </w:t>
+        <w:t>s</w:t>
       </w:r>
       <w:r>
         <w:rPr>
@@ -1606,22 +1572,7 @@
           <w:sz w:val="22"/>
           <w:szCs w:val="22"/>
         </w:rPr>
-        <w:t>3</w:t>
-      </w:r>
-      <w:r>
-        <w:rPr>
-          <w:color w:val="FF0000"/>
-          <w:sz w:val="22"/>
-          <w:szCs w:val="22"/>
-        </w:rPr>
-        <w:t xml:space="preserve"> </w:t>
-      </w:r>
-      <w:r>
-        <w:rPr>
-          <w:sz w:val="22"/>
-          <w:szCs w:val="22"/>
-        </w:rPr>
-        <w:t xml:space="preserve">and </w:t>
+        <w:t xml:space="preserve">day, </w:t>
       </w:r>
       <w:r>
         <w:rPr>
@@ -1631,7 +1582,14 @@
           <w:sz w:val="22"/>
           <w:szCs w:val="22"/>
         </w:rPr>
-        <w:t>Tuesday, April 2</w:t>
+        <w:t>October 1</w:t>
+      </w:r>
+      <w:r>
+        <w:rPr>
+          <w:sz w:val="22"/>
+          <w:szCs w:val="22"/>
+        </w:rPr>
+        <w:t>,</w:t>
       </w:r>
       <w:r>
         <w:rPr>
@@ -1641,7 +1599,62 @@
           <w:sz w:val="22"/>
           <w:szCs w:val="22"/>
         </w:rPr>
-        <w:t>1</w:t>
+        <w:t xml:space="preserve"> Monday, November 2</w:t>
+      </w:r>
+      <w:r>
+        <w:rPr>
+          <w:color w:val="FF0000"/>
+          <w:sz w:val="22"/>
+          <w:szCs w:val="22"/>
+        </w:rPr>
+        <w:t xml:space="preserve"> </w:t>
+      </w:r>
+      <w:r>
+        <w:rPr>
+          <w:sz w:val="22"/>
+          <w:szCs w:val="22"/>
+        </w:rPr>
+        <w:t xml:space="preserve">and </w:t>
+      </w:r>
+      <w:r>
+        <w:rPr>
+          <w:b/>
+          <w:bCs/>
+          <w:color w:val="FF0000"/>
+          <w:sz w:val="22"/>
+          <w:szCs w:val="22"/>
+        </w:rPr>
+        <w:t>T</w:t>
+      </w:r>
+      <w:r>
+        <w:rPr>
+          <w:b/>
+          <w:bCs/>
+          <w:color w:val="FF0000"/>
+          <w:sz w:val="22"/>
+          <w:szCs w:val="22"/>
+        </w:rPr>
+        <w:t>hur</w:t>
+      </w:r>
+      <w:r>
+        <w:rPr>
+          <w:b/>
+          <w:bCs/>
+          <w:color w:val="FF0000"/>
+          <w:sz w:val="22"/>
+          <w:szCs w:val="22"/>
+        </w:rPr>
+        <w:t xml:space="preserve">sday, </w:t>
+      </w:r>
+      <w:r>
+        <w:rPr>
+          <w:b/>
+          <w:bCs/>
+          <w:color w:val="FF0000"/>
+          <w:sz w:val="22"/>
+          <w:szCs w:val="22"/>
+        </w:rPr>
+        <w:t>December 3</w:t>
       </w:r>
       <w:r>
         <w:rPr>
@@ -1729,7 +1742,7 @@
           <w:sz w:val="22"/>
           <w:szCs w:val="22"/>
         </w:rPr>
-        <w:t>Tues</w:t>
+        <w:t>Fri</w:t>
       </w:r>
       <w:r>
         <w:rPr>
@@ -1741,6 +1754,7 @@
         </w:rPr>
         <w:t xml:space="preserve">day, </w:t>
       </w:r>
+      <w:proofErr w:type="spellStart"/>
       <w:r>
         <w:rPr>
           <w:b/>
@@ -1749,8 +1763,9 @@
           <w:sz w:val="22"/>
           <w:szCs w:val="22"/>
         </w:rPr>
-        <w:t xml:space="preserve">May </w:t>
-      </w:r>
+        <w:t>Decmber</w:t>
+      </w:r>
+      <w:proofErr w:type="spellEnd"/>
       <w:r>
         <w:rPr>
           <w:b/>
@@ -1759,7 +1774,27 @@
           <w:sz w:val="22"/>
           <w:szCs w:val="22"/>
         </w:rPr>
-        <w:t>12</w:t>
+        <w:t xml:space="preserve"> </w:t>
+      </w:r>
+      <w:r>
+        <w:rPr>
+          <w:b/>
+          <w:bCs/>
+          <w:color w:val="FF0000"/>
+          <w:sz w:val="22"/>
+          <w:szCs w:val="22"/>
+        </w:rPr>
+        <w:t>1</w:t>
+      </w:r>
+      <w:r>
+        <w:rPr>
+          <w:b/>
+          <w:bCs/>
+          <w:color w:val="FF0000"/>
+          <w:sz w:val="22"/>
+          <w:szCs w:val="22"/>
+        </w:rPr>
+        <w:t>8</w:t>
       </w:r>
       <w:r>
         <w:rPr>
@@ -1986,7 +2021,23 @@
           <w:sz w:val="22"/>
           <w:szCs w:val="22"/>
         </w:rPr>
-        <w:t>is eligible to appear in the midterm or final exams. In practice, a strong majority of exam questions will be similar to a homework question</w:t>
+        <w:t xml:space="preserve">is eligible to appear in the midterm or final exams. In practice, a strong majority of exam questions will be </w:t>
+      </w:r>
+      <w:proofErr w:type="gramStart"/>
+      <w:r>
+        <w:rPr>
+          <w:sz w:val="22"/>
+          <w:szCs w:val="22"/>
+        </w:rPr>
+        <w:t>similar to</w:t>
+      </w:r>
+      <w:proofErr w:type="gramEnd"/>
+      <w:r>
+        <w:rPr>
+          <w:sz w:val="22"/>
+          <w:szCs w:val="22"/>
+        </w:rPr>
+        <w:t xml:space="preserve"> a homework question</w:t>
       </w:r>
       <w:r>
         <w:rPr>
@@ -2179,20 +2230,6 @@
         </w:rPr>
         <w:t>All work must be your own.</w:t>
       </w:r>
-      <w:r>
-        <w:rPr>
-          <w:sz w:val="22"/>
-          <w:szCs w:val="22"/>
-        </w:rPr>
-        <w:t xml:space="preserve"> </w:t>
-      </w:r>
-      <w:r>
-        <w:rPr>
-          <w:sz w:val="22"/>
-          <w:szCs w:val="22"/>
-        </w:rPr>
-        <w:t>Exception: Homework assignment J can be completed in teams of two.</w:t>
-      </w:r>
     </w:p>
     <w:p>
       <w:pPr>
@@ -2252,24 +2289,21 @@
           <w:sz w:val="22"/>
           <w:szCs w:val="22"/>
         </w:rPr>
-        <w:t xml:space="preserve">You may not copy </w:t>
-      </w:r>
-      <w:r>
-        <w:rPr>
-          <w:strike/>
-          <w:color w:val="7030A0"/>
-          <w:sz w:val="22"/>
-          <w:szCs w:val="22"/>
-        </w:rPr>
-        <w:t>or consult</w:t>
-      </w:r>
-      <w:r>
-        <w:rPr>
-          <w:color w:val="7030A0"/>
-          <w:sz w:val="22"/>
-          <w:szCs w:val="22"/>
-        </w:rPr>
-        <w:t xml:space="preserve"> [deleted 1/21/2026]</w:t>
+        <w:t>You may not copy assignment solutions from any source, including online repositories</w:t>
+      </w:r>
+      <w:r>
+        <w:rPr>
+          <w:sz w:val="22"/>
+          <w:szCs w:val="22"/>
+        </w:rPr>
+        <w:t>, AI assistants,</w:t>
+      </w:r>
+      <w:r>
+        <w:rPr>
+          <w:sz w:val="22"/>
+          <w:szCs w:val="22"/>
+        </w:rPr>
+        <w:t xml:space="preserve"> or solutions provided for previous instances of the course.</w:t>
       </w:r>
       <w:r>
         <w:rPr>
@@ -2283,34 +2317,6 @@
           <w:sz w:val="22"/>
           <w:szCs w:val="22"/>
         </w:rPr>
-        <w:t>assignment solutions from any source, including online repositories</w:t>
-      </w:r>
-      <w:r>
-        <w:rPr>
-          <w:sz w:val="22"/>
-          <w:szCs w:val="22"/>
-        </w:rPr>
-        <w:t>, AI assistants,</w:t>
-      </w:r>
-      <w:r>
-        <w:rPr>
-          <w:sz w:val="22"/>
-          <w:szCs w:val="22"/>
-        </w:rPr>
-        <w:t xml:space="preserve"> or solutions provided for previous instances of the course.</w:t>
-      </w:r>
-      <w:r>
-        <w:rPr>
-          <w:sz w:val="22"/>
-          <w:szCs w:val="22"/>
-        </w:rPr>
-        <w:t xml:space="preserve"> </w:t>
-      </w:r>
-      <w:r>
-        <w:rPr>
-          <w:sz w:val="22"/>
-          <w:szCs w:val="22"/>
-        </w:rPr>
         <w:t xml:space="preserve">Exception: </w:t>
       </w:r>
       <w:r>
@@ -2353,7 +2359,21 @@
           <w:sz w:val="22"/>
           <w:szCs w:val="22"/>
         </w:rPr>
-        <w:t>provided for this instance of the course, after they have been posted to Moodle.</w:t>
+        <w:t xml:space="preserve">provided for this instance of the course, after they have been posted to </w:t>
+      </w:r>
+      <w:r>
+        <w:rPr>
+          <w:sz w:val="22"/>
+          <w:szCs w:val="22"/>
+        </w:rPr>
+        <w:t>Brightspace</w:t>
+      </w:r>
+      <w:r>
+        <w:rPr>
+          <w:sz w:val="22"/>
+          <w:szCs w:val="22"/>
+        </w:rPr>
+        <w:t>.</w:t>
       </w:r>
     </w:p>
     <w:p>
@@ -2448,7 +2468,6 @@
           <w:sz w:val="22"/>
           <w:szCs w:val="22"/>
         </w:rPr>
-        <w:lastRenderedPageBreak/>
         <w:t>If you use ideas from any source without using the exact words or code</w:t>
       </w:r>
       <w:r>
@@ -2572,8 +2591,9 @@
           <w:sz w:val="22"/>
           <w:szCs w:val="22"/>
         </w:rPr>
-        <w:t>, you must destroy any written or electronic material that results from the discussion and re-create it later on your own.</w:t>
-      </w:r>
+        <w:t xml:space="preserve">, you must destroy any written or electronic material that results from the discussion and re-create it </w:t>
+      </w:r>
+      <w:proofErr w:type="gramStart"/>
       <w:r>
         <w:rPr>
           <w:b/>
@@ -2581,6 +2601,25 @@
           <w:sz w:val="22"/>
           <w:szCs w:val="22"/>
         </w:rPr>
+        <w:t>later on</w:t>
+      </w:r>
+      <w:proofErr w:type="gramEnd"/>
+      <w:r>
+        <w:rPr>
+          <w:b/>
+          <w:bCs/>
+          <w:sz w:val="22"/>
+          <w:szCs w:val="22"/>
+        </w:rPr>
+        <w:t xml:space="preserve"> your own.</w:t>
+      </w:r>
+      <w:r>
+        <w:rPr>
+          <w:b/>
+          <w:bCs/>
+          <w:sz w:val="22"/>
+          <w:szCs w:val="22"/>
+        </w:rPr>
         <w:t xml:space="preserve"> </w:t>
       </w:r>
       <w:r>
@@ -2616,21 +2655,7 @@
           <w:sz w:val="22"/>
           <w:szCs w:val="22"/>
         </w:rPr>
-        <w:t>1. </w:t>
-      </w:r>
-      <w:r>
-        <w:rPr>
-          <w:sz w:val="22"/>
-          <w:szCs w:val="22"/>
-        </w:rPr>
-        <w:t>As already stated above, it is permissible to copy AI-generated fragments of code for programming tasks, provided suitable acknowledgment is given.</w:t>
-      </w:r>
-      <w:r>
-        <w:rPr>
-          <w:sz w:val="22"/>
-          <w:szCs w:val="22"/>
-        </w:rPr>
-        <w:t xml:space="preserve"> 2. Some homework questions explicitly state that use of AI is permitted or encouraged; in such cases, carefully follow the instructions in the homework to make sure that AI is employed and documented correctly.</w:t>
+        <w:t>Some homework questions explicitly state that use of AI is permitted or encouraged; in such cases, carefully follow the instructions in the homework to make sure that AI is employed and documented correctly.</w:t>
       </w:r>
       <w:r>
         <w:rPr>
@@ -2648,43 +2673,27 @@
           <w:numId w:val="14"/>
         </w:numPr>
         <w:rPr>
-          <w:color w:val="7030A0"/>
-          <w:sz w:val="22"/>
-          <w:szCs w:val="22"/>
-        </w:rPr>
-      </w:pPr>
-      <w:r>
-        <w:rPr>
-          <w:color w:val="7030A0"/>
-          <w:sz w:val="22"/>
-          <w:szCs w:val="22"/>
-        </w:rPr>
-        <w:t>If you have ethical or privacy concerns with using AI tools, please consult with the instructor, as it is usually possible to find satisfactory alternative approaches</w:t>
-      </w:r>
-      <w:r>
-        <w:rPr>
-          <w:color w:val="7030A0"/>
-          <w:sz w:val="22"/>
-          <w:szCs w:val="22"/>
-        </w:rPr>
-        <w:t xml:space="preserve"> [added 1/21/2026]</w:t>
-      </w:r>
-      <w:r>
-        <w:rPr>
-          <w:color w:val="7030A0"/>
-          <w:sz w:val="22"/>
-          <w:szCs w:val="22"/>
-        </w:rPr>
-        <w:t>.</w:t>
+          <w:sz w:val="22"/>
+          <w:szCs w:val="22"/>
+        </w:rPr>
+      </w:pPr>
+      <w:r>
+        <w:rPr>
+          <w:sz w:val="22"/>
+          <w:szCs w:val="22"/>
+        </w:rPr>
+        <w:t>If you have ethical or privacy concerns with using AI tools, please consult with the instructor, as it is usually possible to find satisfactory alternative approaches.</w:t>
       </w:r>
     </w:p>
     <w:p>
       <w:pPr>
         <w:pStyle w:val="Heading3"/>
       </w:pPr>
+      <w:proofErr w:type="gramStart"/>
       <w:r>
         <w:t>Accommodations</w:t>
       </w:r>
+      <w:proofErr w:type="gramEnd"/>
     </w:p>
     <w:p>
       <w:pPr>
@@ -2872,60 +2881,6 @@
           <w:szCs w:val="22"/>
         </w:rPr>
         <w:t xml:space="preserve"> and the total used so far in the semester.</w:t>
-      </w:r>
-    </w:p>
-    <w:p>
-      <w:pPr>
-        <w:pStyle w:val="Heading3"/>
-      </w:pPr>
-      <w:r>
-        <w:t>Recording and posting of class content</w:t>
-      </w:r>
-    </w:p>
-    <w:p>
-      <w:pPr>
-        <w:rPr>
-          <w:sz w:val="22"/>
-          <w:szCs w:val="22"/>
-        </w:rPr>
-      </w:pPr>
-      <w:r>
-        <w:rPr>
-          <w:sz w:val="22"/>
-          <w:szCs w:val="22"/>
-        </w:rPr>
-        <w:t xml:space="preserve">All class meetings will be recorded, and the content will be made available only to members of the class. Do not share or repost class recordings or other content; doing so </w:t>
-      </w:r>
-      <w:r>
-        <w:rPr>
-          <w:sz w:val="22"/>
-          <w:szCs w:val="22"/>
-        </w:rPr>
-        <w:t xml:space="preserve">would be a breach of Dickinson’s </w:t>
-      </w:r>
-      <w:hyperlink r:id="rId7" w:history="1">
-        <w:r>
-          <w:rPr>
-            <w:rStyle w:val="Hyperlink"/>
-            <w:sz w:val="22"/>
-            <w:szCs w:val="22"/>
-          </w:rPr>
-          <w:t>Community Standards</w:t>
-        </w:r>
-      </w:hyperlink>
-      <w:r>
-        <w:rPr>
-          <w:sz w:val="22"/>
-          <w:szCs w:val="22"/>
-        </w:rPr>
-        <w:t>.</w:t>
-      </w:r>
-      <w:r>
-        <w:rPr>
-          <w:sz w:val="22"/>
-          <w:szCs w:val="22"/>
-        </w:rPr>
-        <w:t xml:space="preserve"> Classes may also be recorded for accommodation purposes.</w:t>
       </w:r>
     </w:p>
     <w:sectPr>
@@ -5702,6 +5657,7 @@
   <w:style w:type="character" w:default="1" w:styleId="DefaultParagraphFont">
     <w:name w:val="Default Paragraph Font"/>
     <w:uiPriority w:val="1"/>
+    <w:semiHidden/>
     <w:unhideWhenUsed/>
   </w:style>
   <w:style w:type="table" w:default="1" w:styleId="TableNormal">

</xml_diff>